<commit_message>
Apply the owner's decisions on the course audit
- Red Hat family only for every Linux server; Ubuntu/Debian forms removed.
- Every backup, VLAN 40 included, now lives in course 1.19.
- WSUS01 stays Tier 1 with a procedure; AUDIT01's updates installed by its custodian.
- Audit custodians denied on Tier 2; SBD-ADMIN-PC01 baselined in course 1.8.
- New rule F24: the core router's deny log to SBD-SYSLOG01 (UDP 514).
- 802.1X admits any domain-joined computer; workstation DNS self-registration off by GPO.
- No time thresholds; retention and alert values depend on the environment.
- One server per security tool is a deployment description, not a risk
  (RMF material, Inside the Network, the implementation plan).
- Microsoft "What's new" source retitled without a release number.
- Workbooks, PDFs, covers, checklists, packages and guides rebuilt.

Co-Authored-By: Claude Opus 5.5 <noreply@anthropic.com>
Claude-Session: https://claude.ai/code/session_018zdyUa6VFYrxc61jbbwg95
</commit_message>
<xml_diff>
--- a/public/training/audit-repository/SecureByDesign-audit-repository-Workbook.docx
+++ b/public/training/audit-repository/SecureByDesign-audit-repository-Workbook.docx
@@ -428,7 +428,7 @@
           <w:sz w:val="21"/>
           <w:szCs w:val="21"/>
         </w:rPr>
-        <w:t xml:space="preserve">This is the second of three logging courses: course 1.10 collects the record on SBD-SYSLOG01, this course gives it a protected home on SBD-AUDIT01, and course 1.12 analyzes a working copy in SBD-SPLUNK01. Protection is something you can show: one write path, permissions that refuse even administrators, a hash for every archive, and retention that runs only as an approved, logged process. Retention lengths are sample values; your records requirement decides.</w:t>
+        <w:t xml:space="preserve">This is the second of three logging courses: course 1.10 collects the record on SBD-SYSLOG01, this course gives it a protected home on SBD-AUDIT01, and course 1.12 analyzes a working copy in SBD-SPLUNK01. Protection is something you can show: one write path, permissions that refuse even administrators, a hash for every archive, and retention that runs only as an approved, logged process. How long each stage keeps the record depends on your environment and policy: the course says what each stage keeps and why, and you record the periods you chose.</w:t>
       </w:r>
     </w:p>
     <w:p>
@@ -465,7 +465,7 @@
           <w:sz w:val="21"/>
           <w:szCs w:val="21"/>
         </w:rPr>
-        <w:t xml:space="preserve">Complete course 1.10: SBD-SYSLOG01 collects Windows events into the ForwardedEvents log (on D:\Logs\ForwardedEvents, overwriting the oldest) and syslog into daily files per sender under D:\Logs\Syslog, keeps at least 14 days, and the register carries row F11 waiting for this course.</w:t>
+        <w:t xml:space="preserve">Complete course 1.10: SBD-SYSLOG01 collects Windows events into the ForwardedEvents log (on D:\Logs\ForwardedEvents, overwriting the oldest) and syslog into daily files per sender under D:\Logs\Syslog, keeps the buffer period course 1.10 recorded, and the register carries row F11 waiting for this course.</w:t>
       </w:r>
     </w:p>
     <w:p>
@@ -938,7 +938,7 @@
           <w:sz w:val="21"/>
           <w:szCs w:val="21"/>
         </w:rPr>
-        <w:t xml:space="preserve">Size the repository for course 1.10's retention and the volume the collector actually receives.</w:t>
+        <w:t xml:space="preserve">Size the repository for the retention period you record and the volume the collector actually receives.</w:t>
       </w:r>
     </w:p>
     <w:p>
@@ -1013,7 +1013,7 @@
           <w:sz w:val="21"/>
           <w:szCs w:val="21"/>
         </w:rPr>
-        <w:t xml:space="preserve">Write the repository's rules from course 1.10's design (AU-11; sample values): the collector buffers at least 14 days, the repository keeps one year, and analysis keeps 90 days searchable. The repository holds the protected copy and nothing else — it is not a search tool, and nothing is removed from it except by the custodian's approved, logged retention process.</w:t>
+        <w:t xml:space="preserve">Write the repository's rules from course 1.10's design (AU-11): the collector buffers long enough to cover a missed archive night and a source replaying its backlog; the repository keeps the protected copy for the whole retention period your records policy requires; and analysis keeps a shorter searchable window for investigations. Each period depends on your environment and policy — record the values you chose and who approved them. The repository holds the protected copy and nothing else — it is not a search tool, and nothing is removed from it except by the custodian's approved, logged retention process.</w:t>
       </w:r>
     </w:p>
     <w:p>
@@ -1032,7 +1032,7 @@
           <w:sz w:val="21"/>
           <w:szCs w:val="21"/>
         </w:rPr>
-        <w:t xml:space="preserve">Size it (AU-4): on SBD-SYSLOG01, export the last 24 hours of ForwardedEvents to a temporary file and add up the syslog files written in the same day. Multiply a typical day by 365, add headroom for growth (the fleet joins in course 1.13, so revisit the figure then), and record the D: size and the same 80 percent warning threshold the collector uses.</w:t>
+        <w:t xml:space="preserve">Size it (AU-4): on SBD-SYSLOG01, export the last 24 hours of ForwardedEvents to a temporary file and add up the syslog files written in the same day. Multiply a typical day by the days in your recorded retention period, add headroom for growth (the fleet joins in course 1.13, so revisit the figure then), and record the D: size and a disk-space warning threshold set the way the collector's is — a value that depends on your environment, recorded with the reason.</w:t>
       </w:r>
     </w:p>
     <w:p>
@@ -1089,7 +1089,7 @@
           <w:sz w:val="21"/>
           <w:szCs w:val="21"/>
         </w:rPr>
-        <w:t xml:space="preserve">Build SBD-AUDIT01 (10.0.50.40, VLAN 50) as Windows Server with its data volume, DNS on both domain controllers, and time from the domain hierarchy (course 1.3): hypervisor time synchronization off, and w32tm /query /source naming a domain controller. Join it into a new Audit Servers OU (OU=Audit Servers,OU=SBD,DC=sbd,DC=test, created from AdminJumpBox01 with deletion protection) that already carries course 1.5's member-server STIG GPOs and course 1.8's two deny GPOs (the tier logon GPO and the network-logon deny GPO, never its Servers administrators GPO), so nothing granted to ordinary server administrators through the Servers OU reaches it. By GPO on that OU, make SBD Audit Custodians the local Administrators in place of Domain Admins, as the STIG's member-server rule requires, put SBD Auditors in Remote Management Users, and scope Remote Desktop and Windows Remote Management to SBD-ADMIN-SRV01 (10.0.60.20).</w:t>
+        <w:t xml:space="preserve">Build SBD-AUDIT01 (10.0.50.40, VLAN 50) as Windows Server with its data volume, DNS on both domain controllers, and time from the domain hierarchy (course 1.3): hypervisor time synchronization off, and w32tm /query /source naming a domain controller. Join it into a new Audit Servers OU (OU=Audit Servers,OU=SBD,DC=sbd,DC=test, created from AdminJumpBox01 with deletion protection) that already carries course 1.5's member-server STIG GPOs and course 1.8's two deny GPOs (the tier logon GPO and the network-logon deny GPO, never its Servers administrators GPO), so nothing granted to ordinary server administrators through the Servers OU reaches it. By GPO on that OU, make SBD Audit Custodians the local Administrators in place of Domain Admins, as the STIG's member-server rule requires, put SBD Auditors in Remote Management Users, and scope Remote Desktop and Windows Remote Management to SBD-ADMIN-SRV01 (10.0.60.20). Its Windows updates come through SBD-WSUS01 once course 1.14 builds it, in a group of their own: downloaded only, and installed when the custodian starts them, never by ordinary Tier 1 operators.</w:t>
       </w:r>
     </w:p>
     <w:p>
@@ -1297,7 +1297,7 @@
           <w:sz w:val="20"/>
           <w:szCs w:val="20"/>
         </w:rPr>
-        <w:t xml:space="preserve">The rules, sizing, and identity table are written; the KDS root key exists with its effective time recorded; and SBD-AUDIT01 sits in the Audit Servers OU with SBD Audit Custodians in place of Domain Admins and management allowed from SBD-ADMIN-SRV01 alone, and its time comes from a domain controller.</w:t>
+        <w:t xml:space="preserve">The rules with their recorded retention periods, the sizing, and the identity table are written; the KDS root key exists with its effective time recorded; and SBD-AUDIT01 sits in the Audit Servers OU with SBD Audit Custodians in place of Domain Admins and management allowed from SBD-ADMIN-SRV01 alone, and its time comes from a domain controller.</w:t>
       </w:r>
     </w:p>
     <w:p>
@@ -1876,7 +1876,7 @@
           <w:sz w:val="20"/>
           <w:szCs w:val="20"/>
         </w:rPr>
-        <w:t xml:space="preserve">The repository keeps one year; the collector and analysis keep working copies.  One write path (F11), one writer, and one identity that can delete.  SBD-AUDIT01 is built in its own OU and run only by the custodian.</w:t>
+        <w:t xml:space="preserve">The repository keeps the record for the whole recorded retention period; the collector and analysis keep shorter working copies.  One write path (F11), one writer, and one identity that can delete.  SBD-AUDIT01 is built in its own OU and run only by the custodian, who also installs its updates.</w:t>
       </w:r>
     </w:p>
     <w:p>
@@ -2202,7 +2202,7 @@
           <w:sz w:val="21"/>
           <w:szCs w:val="21"/>
         </w:rPr>
-        <w:t xml:space="preserve">Each run, the script exports every completed UTC day not yet archived from ForwardedEvents into its staging folder — wevtutil epl with a TimeCreated filter for that day — and zips that day's syslog files, so a missed night is caught up while the collector's 14-day buffer still holds the events. It writes each file's SHA-256 (Get-FileHash) into a .sha256 file, copies the archive and then its .sha256 to the share, and keeps its own list of what it sent, because the writer can't list the share. When course 1.10's health check records a gap window, re-export the affected days once the source has replayed its backlog, under a new name such as ForwardedEvents-2026-10-12-r1.evtx: forwarded events keep their source's times, so the late ones land in the right day, and the first archive stays as it was.</w:t>
+        <w:t xml:space="preserve">Each run, the script exports every completed UTC day not yet archived from ForwardedEvents into its staging folder — wevtutil epl with a TimeCreated filter for that day — and zips that day's syslog files, so a missed night is caught up while the collector's buffer still holds the events. It writes each file's SHA-256 (Get-FileHash) into a .sha256 file, copies the archive and then its .sha256 to the share, and keeps its own list of what it sent, because the writer can't list the share. When course 1.10's health check records a gap window, re-export the affected days once the source has replayed its backlog, under a new name such as ForwardedEvents-2026-10-12-r1.evtx: forwarded events keep their source's times, so the late ones land in the right day, and the first archive stays as it was.</w:t>
       </w:r>
     </w:p>
     <w:p>
@@ -2221,7 +2221,7 @@
           <w:sz w:val="21"/>
           <w:szCs w:val="21"/>
         </w:rPr>
-        <w:t xml:space="preserve">On SBD-AUDIT01, register the catalog task the same way, hourly as SBD-Catalog$, with Log on as a batch job through the Audit Servers OU's policy and write, but not delete, on the Catalog folder and the files in it. For each archive whose .sha256 has arrived, it computes the SHA-256, appends a line to catalog.csv (columns Arrived, File, Size, SentSHA256, SHA256, Result), and writes the same line as an event from the source SBD-Repository (registered once with New-EventLog): 1000 when the hashes match, 1001 when they don't or a .sha256 is still missing after a day — a finding, not a file. Then fill in the AU table: where each stage's data lives, its retention clock, and who can touch it — the kind of artifact course 2.2 shows joining the Body of Evidence for the audit controls.</w:t>
+        <w:t xml:space="preserve">On SBD-AUDIT01, register the catalog task the same way, hourly as SBD-Catalog$, with Log on as a batch job through the Audit Servers OU's policy and write, but not delete, on the Catalog folder and the files in it. For each archive whose .sha256 has arrived, it computes the SHA-256, appends a line to catalog.csv (columns Arrived, File, Size, SentSHA256, SHA256, Result), and writes the same line as an event from the source SBD-Repository (registered once with New-EventLog): 1000 when the hashes match, 1001 when they don't or a .sha256 is still missing after the wait you set and recorded — a finding, not a file. Then fill in the AU table: where each stage's data lives, its retention clock, and who can touch it — the kind of artifact course 2.2 shows joining the Body of Evidence for the audit controls.</w:t>
       </w:r>
     </w:p>
     <w:p>
@@ -3378,7 +3378,7 @@
           <w:sz w:val="21"/>
           <w:szCs w:val="21"/>
         </w:rPr>
-        <w:t xml:space="preserve">Treat event 1101 as a finding: don't re-hash the file until it passes, edit its catalog line, or delete it. Record what failed and when it last verified, and read the repository's access events for that window. Re-export that day under a new name through the normal path while the collector's 14-day buffer still holds it — or, once course 1.19 has made them, recover an offline copy — keep the damaged file as evidence, and have the custodian report an incident.</w:t>
+        <w:t xml:space="preserve">Treat event 1101 as a finding: don't re-hash the file until it passes, edit its catalog line, or delete it. Record what failed and when it last verified, and read the repository's access events for that window. Re-export that day under a new name through the normal path while the collector's buffer still holds it — or, once course 1.19 has made them, recover an offline copy — keep the damaged file as evidence, and have the custodian report an incident.</w:t>
       </w:r>
     </w:p>
     <w:p>
@@ -4537,7 +4537,7 @@
           <w:sz w:val="21"/>
           <w:szCs w:val="21"/>
         </w:rPr>
-        <w:t xml:space="preserve">Build the retention task on SBD-AUDIT01 to run as SBD-Retention$ (batch logon, like SBD-Catalog$) with no trigger, so it runs only when the custodian starts it. It reads the newest approved list in D:\LogArchive\Retention, re-verifies each listed archive against the catalog, refuses any file younger than the one-year retention period by its catalog arrival date — whatever the list says — and deletes the rest with their .sha256 files. It appends one line per file to retention-log.csv (date, file, catalog hash, list hash, result), which the daily verification now reads, so a retired archive reports RETIRED rather than MISSING. SBD-Retention$ gets write on the Retention folder and the custodians create files there only, so a list can be added but not edited.</w:t>
+        <w:t xml:space="preserve">Build the retention task on SBD-AUDIT01 to run as SBD-Retention$ (batch logon, like SBD-Catalog$) with no trigger, so it runs only when the custodian starts it. It reads the newest approved list in D:\LogArchive\Retention, re-verifies each listed archive against the catalog, refuses any file younger than the recorded retention period by its catalog arrival date — whatever the list says — and deletes the rest with their .sha256 files. It appends one line per file to retention-log.csv (date, file, catalog hash, list hash, result), which the daily verification now reads, so a retired archive reports RETIRED rather than MISSING. SBD-Retention$ gets write on the Retention folder and the custodians create files there only, so a list can be added but not edited.</w:t>
       </w:r>
     </w:p>
     <w:p>
@@ -4575,7 +4575,7 @@
           <w:sz w:val="21"/>
           <w:szCs w:val="21"/>
         </w:rPr>
-        <w:t xml:space="preserve">Prove the guard now: nothing in a new lab is a year old, so put one archive from lesson 2 on an approved list marked as a test. The run must refuse it, log the refusal, and leave the file and its catalog line untouched.</w:t>
+        <w:t xml:space="preserve">Prove the guard now: nothing in a new lab is past its retention period, so put one archive from lesson 2 on an approved list marked as a test. The run must refuse it, log the refusal, and leave the file and its catalog line untouched.</w:t>
       </w:r>
     </w:p>
     <w:p>
@@ -4613,7 +4613,7 @@
           <w:sz w:val="21"/>
           <w:szCs w:val="21"/>
         </w:rPr>
-        <w:t xml:space="preserve">Record the retrieval — the archive, both hashes, the events you read, who, and when — and repeat it each quarter with an older archive, so by the end of the first year you have proven retrieval across the whole retention period. Course 1.19 retrieves the offline copies the same way.</w:t>
+        <w:t xml:space="preserve">Record the retrieval — the archive, both hashes, the events you read, who, and when — and repeat it each quarter with an older archive, so over time you prove retrieval across the whole retention period. Course 1.19 retrieves the offline copies the same way.</w:t>
       </w:r>
     </w:p>
     <w:p>
@@ -5726,7 +5726,7 @@
           <w:sz w:val="21"/>
           <w:szCs w:val="21"/>
         </w:rPr>
-        <w:t xml:space="preserve">Write the handoff to course 1.12: the repository keeps the protected copy and stays out of the analysis flow, which takes its working copy from the collector over F10; a day's events reach the repository in the next morning's archive, which is where an end-to-end trace finds them; the repository's events — 1001 and 1101 findings, refused access, and retention deletions — are ready to become alerts; and the audit custodian carries offline copies of the archive and its catalog to the backup cabinet in course 1.19.</w:t>
+        <w:t xml:space="preserve">Write the handoff to course 1.12: the repository keeps the protected copy and stays out of the analysis flow, which takes its working copy from the collector over F10; a day's events reach the repository in the next morning's archive, which is where an end-to-end trace finds them; the repository's events — 1001 and 1101 findings, refused access, and retention deletions — are ready to become alerts; and course 1.19 sets up the backup of the archive and its catalog, which the audit custodian carries to the backup cabinet.</w:t>
       </w:r>
     </w:p>
     <w:p>

</xml_diff>

<commit_message>
Course 1.1: Build and harden the identity foundation (courses 1.1–1.8 merged); later courses renumber 1.2–1.12
Owner direction, 20 October 2026. One tile and guide of eight parts and 46 lessons replaces courses
1.1–1.8, enhanced with the US design references: a new Active Directory design lesson opens part 1, and
the first lesson of every other part checks its design against the matching reference. Later build courses
renumber 1.9–1.19 → 1.2–1.12 everywhere their numbers appear.

- scripts/compose-identity-foundation.py (one-time migration) built the course, its guide, scene,
  catalog entry, progress list and moves, and renumbered the content.
- The guide shows part headings; old guide addresses redirect to their part, and old lesson links open
  the same lesson. drizzle/0019 carries stored progress, activity and guide state.
- 120-page workbook; renumbered workbooks synced and covers redrawn. 192 tests pass.
</commit_message>
<xml_diff>
--- a/public/training/audit-repository/SecureByDesign-audit-repository-Workbook.docx
+++ b/public/training/audit-repository/SecureByDesign-audit-repository-Workbook.docx
@@ -90,7 +90,7 @@
           <w:sz w:val="16"/>
           <w:szCs w:val="16"/>
         </w:rPr>
-        <w:t xml:space="preserve">COURSE 1.11    /    COMPANION WORKBOOK</w:t>
+        <w:t xml:space="preserve">COURSE 1.4    /    COMPANION WORKBOOK</w:t>
       </w:r>
     </w:p>
     <w:p>
@@ -150,7 +150,7 @@
           <w:sz w:val="16"/>
           <w:szCs w:val="16"/>
         </w:rPr>
-        <w:t xml:space="preserve">MATERIALS EDITION 1.0    /    COURSE 1.11</w:t>
+        <w:t xml:space="preserve">MATERIALS EDITION 1.0    /    COURSE 1.4</w:t>
       </w:r>
     </w:p>
     <w:p>
@@ -395,7 +395,7 @@
           <w:sz w:val="16"/>
           <w:szCs w:val="16"/>
         </w:rPr>
-        <w:t xml:space="preserve">COURSE 1.11 / PREREQUISITES</w:t>
+        <w:t xml:space="preserve">COURSE 1.4 / PREREQUISITES</w:t>
       </w:r>
     </w:p>
     <w:p>
@@ -428,7 +428,7 @@
           <w:sz w:val="21"/>
           <w:szCs w:val="21"/>
         </w:rPr>
-        <w:t xml:space="preserve">This is the second of three logging courses: course 1.10 collects the record on SBD-SYSLOG01, this course gives it a protected home on SBD-AUDIT01, and course 1.12 analyzes a working copy in SBD-SPLUNK01. Protection is something you can show: one write path, permissions that refuse even administrators, a hash for every archive, and retention that runs only as an approved, logged process. How long each stage keeps the record depends on your environment and policy: the course says what each stage keeps and why, and you record the periods you chose.</w:t>
+        <w:t xml:space="preserve">This is the second of three logging courses: course 1.3 collects the record on SBD-SYSLOG01, this course gives it a protected home on SBD-AUDIT01, and course 1.5 analyzes a working copy in SBD-SPLUNK01. Protection is something you can show: one write path, permissions that refuse even administrators, a hash for every archive, and retention that runs only as an approved, logged process. How long each stage keeps the record depends on your environment and policy: the course says what each stage keeps and why, and you record the periods you chose.</w:t>
       </w:r>
     </w:p>
     <w:p>
@@ -465,7 +465,7 @@
           <w:sz w:val="21"/>
           <w:szCs w:val="21"/>
         </w:rPr>
-        <w:t xml:space="preserve">Complete course 1.10: SBD-SYSLOG01 collects Windows events into the ForwardedEvents log (on D:\Logs\ForwardedEvents, overwriting the oldest) and syslog into daily files per sender under D:\Logs\Syslog, keeps the buffer period course 1.10 recorded, and the register carries row F11 waiting for this course.</w:t>
+        <w:t xml:space="preserve">Complete course 1.3: SBD-SYSLOG01 collects Windows events into the ForwardedEvents log (on D:\Logs\ForwardedEvents, overwriting the oldest) and syslog into daily files per sender under D:\Logs\Syslog, keeps the buffer period course 1.3 recorded, and the register carries row F11 waiting for this course.</w:t>
       </w:r>
     </w:p>
     <w:p>
@@ -503,7 +503,7 @@
           <w:sz w:val="21"/>
           <w:szCs w:val="21"/>
         </w:rPr>
-        <w:t xml:space="preserve">Have course 1.8's administration seats in place — the audit custodian's separate accounts in SBD Audit Custodians work from SBD-ADMIN-SRV01 (rule A04), and directory changes are Tier 0 work from AdminJumpBox01 — plus the Tier 1 SCC copy course 1.8 installed on SBD-ADMIN-SRV01, at course 1.4's tool and benchmark versions, for the first baseline.</w:t>
+        <w:t xml:space="preserve">Have course 1.1's administration seats in place — the audit custodian's separate accounts in SBD Audit Custodians work from SBD-ADMIN-SRV01 (rule A04), and directory changes are Tier 0 work from AdminJumpBox01 — plus the Tier 1 SCC copy course 1.1 installed on SBD-ADMIN-SRV01, at course 1.1's tool and benchmark versions, for the first baseline.</w:t>
       </w:r>
     </w:p>
     <w:p>
@@ -1013,7 +1013,7 @@
           <w:sz w:val="21"/>
           <w:szCs w:val="21"/>
         </w:rPr>
-        <w:t xml:space="preserve">Write the repository's rules from course 1.10's design (AU-11): the collector buffers long enough to cover a missed archive night and a source replaying its backlog; the repository keeps the protected copy for the whole retention period your records policy requires; and analysis keeps a shorter searchable window for investigations. Each period depends on your environment and policy — record the values you chose and who approved them. The repository holds the protected copy and nothing else — it is not a search tool, and nothing is removed from it except by the custodian's approved, logged retention process.</w:t>
+        <w:t xml:space="preserve">Write the repository's rules from course 1.3's design (AU-11): the collector buffers long enough to cover a missed archive night and a source replaying its backlog; the repository keeps the protected copy for the whole retention period your records policy requires; and analysis keeps a shorter searchable window for investigations. Each period depends on your environment and policy — record the values you chose and who approved them. The repository holds the protected copy and nothing else — it is not a search tool, and nothing is removed from it except by the custodian's approved, logged retention process.</w:t>
       </w:r>
     </w:p>
     <w:p>
@@ -1032,7 +1032,7 @@
           <w:sz w:val="21"/>
           <w:szCs w:val="21"/>
         </w:rPr>
-        <w:t xml:space="preserve">Size it (AU-4): on SBD-SYSLOG01, export the last 24 hours of ForwardedEvents to a temporary file and add up the syslog files written in the same day. Multiply a typical day by the days in your recorded retention period, add headroom for growth (the fleet joins in course 1.13, so revisit the figure then), and record the D: size and a disk-space warning threshold set the way the collector's is — a value that depends on your environment, recorded with the reason.</w:t>
+        <w:t xml:space="preserve">Size it (AU-4): on SBD-SYSLOG01, export the last 24 hours of ForwardedEvents to a temporary file and add up the syslog files written in the same day. Multiply a typical day by the days in your recorded retention period, add headroom for growth (the fleet joins in course 1.6, so revisit the figure then), and record the D: size and a disk-space warning threshold set the way the collector's is — a value that depends on your environment, recorded with the reason.</w:t>
       </w:r>
     </w:p>
     <w:p>
@@ -1070,7 +1070,7 @@
           <w:sz w:val="21"/>
           <w:szCs w:val="21"/>
         </w:rPr>
-        <w:t xml:space="preserve">Name every other identity and its one job: SBD-Catalog$ hashes arrivals, SBD-Retention$ is the only account the design lets delete, SBD Auditors read the record in remote sessions from SBD-ADMIN-SRV01, and SBD Audit Custodians (course 1.8) — the custodian's separate admin accounts — run the server but can't delete records either. In a Tier 0 session from AdminJumpBox01, create SBD Auditors under the Groups OU, add it to SBD-ADMIN-SRV01's seat GPO beside SBD Tier 1 Admins and SBD Audit Custodians (Allow log on locally, a change to course 1.8's STIG value that its exception record notes), and run Get-KdsRootKey on SBD-DC01. If it returns nothing, create the forest's one KDS root key with Add-KdsRootKey -EffectiveImmediately now: domain controllers wait up to ten hours before gMSAs can be created and used, so lesson 2 creates the accounts.</w:t>
+        <w:t xml:space="preserve">Name every other identity and its one job: SBD-Catalog$ hashes arrivals, SBD-Retention$ is the only account the design lets delete, SBD Auditors read the record in remote sessions from SBD-ADMIN-SRV01, and SBD Audit Custodians (course 1.1) — the custodian's separate admin accounts — run the server but can't delete records either. In a Tier 0 session from AdminJumpBox01, create SBD Auditors under the Groups OU, add it to SBD-ADMIN-SRV01's seat GPO beside SBD Tier 1 Admins and SBD Audit Custodians (Allow log on locally, a change to course 1.1's STIG value that its exception record notes), and run Get-KdsRootKey on SBD-DC01. If it returns nothing, create the forest's one KDS root key with Add-KdsRootKey -EffectiveImmediately now: domain controllers wait up to ten hours before gMSAs can be created and used, so lesson 2 creates the accounts.</w:t>
       </w:r>
     </w:p>
     <w:p>
@@ -1089,7 +1089,7 @@
           <w:sz w:val="21"/>
           <w:szCs w:val="21"/>
         </w:rPr>
-        <w:t xml:space="preserve">Build SBD-AUDIT01 (10.0.50.40, VLAN 50) as Windows Server with its data volume, DNS on both domain controllers, and time from the domain hierarchy (course 1.3): hypervisor time synchronization off, and w32tm /query /source naming a domain controller. Join it into a new Audit Servers OU (OU=Audit Servers,OU=SBD,DC=sbd,DC=test, created from AdminJumpBox01 with deletion protection) that already carries course 1.5's member-server STIG GPOs and course 1.8's two deny GPOs (the tier logon GPO and the network-logon deny GPO, never its Servers administrators GPO), so nothing granted to ordinary server administrators through the Servers OU reaches it. By GPO on that OU, make SBD Audit Custodians the local Administrators in place of Domain Admins, as the STIG's member-server rule requires, put SBD Auditors in Remote Management Users, and scope Remote Desktop and Windows Remote Management to SBD-ADMIN-SRV01 (10.0.60.20). Its Windows updates come through SBD-WSUS01 once course 1.14 builds it, in a group of their own: downloaded only, and installed when the custodian starts them, never by ordinary Tier 1 operators.</w:t>
+        <w:t xml:space="preserve">Build SBD-AUDIT01 (10.0.50.40, VLAN 50) as Windows Server with its data volume, DNS on both domain controllers, and time from the domain hierarchy (course 1.1): hypervisor time synchronization off, and w32tm /query /source naming a domain controller. Join it into a new Audit Servers OU (OU=Audit Servers,OU=SBD,DC=sbd,DC=test, created from AdminJumpBox01 with deletion protection) that already carries course 1.1's member-server STIG GPOs and course 1.1's two deny GPOs (the tier logon GPO and the network-logon deny GPO, never its Servers administrators GPO), so nothing granted to ordinary server administrators through the Servers OU reaches it. By GPO on that OU, make SBD Audit Custodians the local Administrators in place of Domain Admins, as the STIG's member-server rule requires, put SBD Auditors in Remote Management Users, and scope Remote Desktop and Windows Remote Management to SBD-ADMIN-SRV01 (10.0.60.20). Its Windows updates come through SBD-WSUS01 once course 1.7 builds it, in a group of their own: downloaded only, and installed when the custodian starts them, never by ordinary Tier 1 operators.</w:t>
       </w:r>
     </w:p>
     <w:p>
@@ -2164,7 +2164,7 @@
           <w:sz w:val="21"/>
           <w:szCs w:val="21"/>
         </w:rPr>
-        <w:t xml:space="preserve">Share it: New-SmbShare -Name LogArchive -Path D:\LogArchive -EncryptData $true -ChangeAccess 'SBD\SBD-Archive$'. Share permissions are only the outer gate for network access — effective access is the stricter of share and NTFS — so the share names its one writer, and Get-SmbShareAccess must show nobody else, not even Everyone. Leave RejectUnencryptedAccess at its default (True) with SMB 1 off, so only encrypted SMB 3 sessions reach the share, and scope every enabled inbound rule for TCP 445 to 10.0.20.20: VLAN 50 will also hold SBD-SPLUNK01 (course 1.12) and the other security servers the System Hub places there, whose traffic to this server never crosses the core, so only this host firewall stops them.</w:t>
+        <w:t xml:space="preserve">Share it: New-SmbShare -Name LogArchive -Path D:\LogArchive -EncryptData $true -ChangeAccess 'SBD\SBD-Archive$'. Share permissions are only the outer gate for network access — effective access is the stricter of share and NTFS — so the share names its one writer, and Get-SmbShareAccess must show nobody else, not even Everyone. Leave RejectUnencryptedAccess at its default (True) with SMB 1 off, so only encrypted SMB 3 sessions reach the share, and scope every enabled inbound rule for TCP 445 to 10.0.20.20: VLAN 50 will also hold SBD-SPLUNK01 (course 1.5) and the other security servers the System Hub places there, whose traffic to this server never crosses the core, so only this host firewall stops them.</w:t>
       </w:r>
     </w:p>
     <w:p>
@@ -2183,7 +2183,7 @@
           <w:sz w:val="21"/>
           <w:szCs w:val="21"/>
         </w:rPr>
-        <w:t xml:space="preserve">On SBD-SYSLOG01 (Tier 1 work), register the archive task to run daily at 01:00 as SBD-Archive$: Register-ScheduledTask with New-ScheduledTaskPrincipal -UserId 'SBD\SBD-Archive$' -LogonType Password — no password is typed; Windows retrieves the managed one. Keep the script in a folder only administrators can change, because whoever can edit it acts as the writer. Through a GPO filtered to SBD-SYSLOG01 and linked above the STIG GPO, give SBD-Archive$ Log on as a batch job and add it to Event Log Readers with a Group Policy preference that adds a member rather than replacing the list (course 1.12 adds the Splunk forwarder's account to the same group the same way) — user rights don't merge across GPOs, so the list repeats any entries the STIG sets for that right — then grant it read on D:\Logs\Syslog and a staging folder of its own, and send the grants to the owner of the course 1.5 exception record on AdminJumpBox01.</w:t>
+        <w:t xml:space="preserve">On SBD-SYSLOG01 (Tier 1 work), register the archive task to run daily at 01:00 as SBD-Archive$: Register-ScheduledTask with New-ScheduledTaskPrincipal -UserId 'SBD\SBD-Archive$' -LogonType Password — no password is typed; Windows retrieves the managed one. Keep the script in a folder only administrators can change, because whoever can edit it acts as the writer. Through a GPO filtered to SBD-SYSLOG01 and linked above the STIG GPO, give SBD-Archive$ Log on as a batch job and add it to Event Log Readers with a Group Policy preference that adds a member rather than replacing the list (course 1.5 adds the Splunk forwarder's account to the same group the same way) — user rights don't merge across GPOs, so the list repeats any entries the STIG sets for that right — then grant it read on D:\Logs\Syslog and a staging folder of its own, and send the grants to the owner of the course 1.1 exception record on AdminJumpBox01.</w:t>
       </w:r>
     </w:p>
     <w:p>
@@ -2202,7 +2202,7 @@
           <w:sz w:val="21"/>
           <w:szCs w:val="21"/>
         </w:rPr>
-        <w:t xml:space="preserve">Each run, the script exports every completed UTC day not yet archived from ForwardedEvents into its staging folder — wevtutil epl with a TimeCreated filter for that day — and zips that day's syslog files, so a missed night is caught up while the collector's buffer still holds the events. It writes each file's SHA-256 (Get-FileHash) into a .sha256 file, copies the archive and then its .sha256 to the share, and keeps its own list of what it sent, because the writer can't list the share. When course 1.10's health check records a gap window, re-export the affected days once the source has replayed its backlog, under a new name such as ForwardedEvents-2026-10-12-r1.evtx: forwarded events keep their source's times, so the late ones land in the right day, and the first archive stays as it was.</w:t>
+        <w:t xml:space="preserve">Each run, the script exports every completed UTC day not yet archived from ForwardedEvents into its staging folder — wevtutil epl with a TimeCreated filter for that day — and zips that day's syslog files, so a missed night is caught up while the collector's buffer still holds the events. It writes each file's SHA-256 (Get-FileHash) into a .sha256 file, copies the archive and then its .sha256 to the share, and keeps its own list of what it sent, because the writer can't list the share. When course 1.3's health check records a gap window, re-export the affected days once the source has replayed its backlog, under a new name such as ForwardedEvents-2026-10-12-r1.evtx: forwarded events keep their source's times, so the late ones land in the right day, and the first archive stays as it was.</w:t>
       </w:r>
     </w:p>
     <w:p>
@@ -3378,7 +3378,7 @@
           <w:sz w:val="21"/>
           <w:szCs w:val="21"/>
         </w:rPr>
-        <w:t xml:space="preserve">Treat event 1101 as a finding: don't re-hash the file until it passes, edit its catalog line, or delete it. Record what failed and when it last verified, and read the repository's access events for that window. Re-export that day under a new name through the normal path while the collector's buffer still holds it — or, once course 1.19 has made them, recover an offline copy — keep the damaged file as evidence, and have the custodian report an incident.</w:t>
+        <w:t xml:space="preserve">Treat event 1101 as a finding: don't re-hash the file until it passes, edit its catalog line, or delete it. Record what failed and when it last verified, and read the repository's access events for that window. Re-export that day under a new name through the normal path while the collector's buffer still holds it — or, once course 1.12 has made them, recover an offline copy — keep the damaged file as evidence, and have the custodian report an incident.</w:t>
       </w:r>
     </w:p>
     <w:p>
@@ -3416,7 +3416,7 @@
           <w:sz w:val="21"/>
           <w:szCs w:val="21"/>
         </w:rPr>
-        <w:t xml:space="preserve">Send that trail off the box: from AdminJumpBox01, add SBD-AUDIT01 to SBD Event Sources, link course 1.10's enrolling GPO to the Audit Servers OU, and restart SBD-AUDIT01 so both apply. On the collector, widen the WinRM 5985 scope to 10.0.50.40 (rule F17): its Security log, with events 4656, 4660, 4663, 4670, and 5145, now arrives through the subscription's Security query, so add only a query for its SBD-Repository events in the Application log, filtered to that computer. Someone who can alter SBD-AUDIT01's logs or its catalog still can't reach the copies on the collector, which other administrators run.</w:t>
+        <w:t xml:space="preserve">Send that trail off the box: from AdminJumpBox01, add SBD-AUDIT01 to SBD Event Sources, link course 1.3's enrolling GPO to the Audit Servers OU, and restart SBD-AUDIT01 so both apply. On the collector, widen the WinRM 5985 scope to 10.0.50.40 (rule F17): its Security log, with events 4656, 4660, 4663, 4670, and 5145, now arrives through the subscription's Security query, so add only a query for its SBD-Repository events in the Application log, filtered to that computer. Someone who can alter SBD-AUDIT01's logs or its catalog still can't reach the copies on the collector, which other administrators run.</w:t>
       </w:r>
     </w:p>
     <w:p>
@@ -4613,7 +4613,7 @@
           <w:sz w:val="21"/>
           <w:szCs w:val="21"/>
         </w:rPr>
-        <w:t xml:space="preserve">Record the retrieval — the archive, both hashes, the events you read, who, and when — and repeat it each quarter with an older archive, so over time you prove retrieval across the whole retention period. Course 1.19 retrieves the offline copies the same way.</w:t>
+        <w:t xml:space="preserve">Record the retrieval — the archive, both hashes, the events you read, who, and when — and repeat it each quarter with an older archive, so over time you prove retrieval across the whole retention period. Course 1.12 retrieves the offline copies the same way.</w:t>
       </w:r>
     </w:p>
     <w:p>
@@ -5613,7 +5613,7 @@
           <w:sz w:val="21"/>
           <w:szCs w:val="21"/>
         </w:rPr>
-        <w:t xml:space="preserve">Baseline SBD-AUDIT01 and write the handoff to course 1.12.</w:t>
+        <w:t xml:space="preserve">Baseline SBD-AUDIT01 and write the handoff to course 1.5.</w:t>
       </w:r>
     </w:p>
     <w:p>
@@ -5688,7 +5688,7 @@
           <w:sz w:val="21"/>
           <w:szCs w:val="21"/>
         </w:rPr>
-        <w:t xml:space="preserve">Tamper with a copy, never the record: copy the newest archive to D:\Retrieval\tamper-test, append one byte to the copy, and compare its SHA-256 with the catalog line. The copy must fail while the record still matches — the same check that would catch an altered offline copy in course 1.19.</w:t>
+        <w:t xml:space="preserve">Tamper with a copy, never the record: copy the newest archive to D:\Retrieval\tamper-test, append one byte to the copy, and compare its SHA-256 with the catalog line. The copy must fail while the record still matches — the same check that would catch an altered offline copy in course 1.12.</w:t>
       </w:r>
     </w:p>
     <w:p>
@@ -5707,7 +5707,7 @@
           <w:sz w:val="21"/>
           <w:szCs w:val="21"/>
         </w:rPr>
-        <w:t xml:space="preserve">Take SBD-AUDIT01's first SCAP baseline with the course 1.4 SCC and benchmark versions, run locally in the custodian's session: this server refuses SMB from VLAN 60, so a remote scan can't reach it, and the installer arrives from SBD-ADMIN-SRV01's course 1.8 copy over PowerShell remoting (Copy-Item -ToSession) with its course 1.4 hash checked. Store the results under C:\Evidence\audit-repository with hashes, and classify open items as course 1.4 taught — fix by GPO, deviation candidate, or POA&amp;M candidate — noting this course's documented additions: batch-logon rights and object-access auditing.</w:t>
+        <w:t xml:space="preserve">Take SBD-AUDIT01's first SCAP baseline with the course 1.1 SCC and benchmark versions, run locally in the custodian's session: this server refuses SMB from VLAN 60, so a remote scan can't reach it, and the installer arrives from SBD-ADMIN-SRV01's course 1.1 copy over PowerShell remoting (Copy-Item -ToSession) with its course 1.1 hash checked. Store the results under C:\Evidence\audit-repository with hashes, and classify open items as course 1.1 taught — fix by GPO, deviation candidate, or POA&amp;M candidate — noting this course's documented additions: batch-logon rights and object-access auditing.</w:t>
       </w:r>
     </w:p>
     <w:p>
@@ -5726,7 +5726,7 @@
           <w:sz w:val="21"/>
           <w:szCs w:val="21"/>
         </w:rPr>
-        <w:t xml:space="preserve">Write the handoff to course 1.12: the repository keeps the protected copy and stays out of the analysis flow, which takes its working copy from the collector over F10; a day's events reach the repository in the next morning's archive, which is where an end-to-end trace finds them; the repository's events — 1001 and 1101 findings, refused access, and retention deletions — are ready to become alerts; and course 1.19 sets up the backup of the archive and its catalog, which the audit custodian carries to the backup cabinet.</w:t>
+        <w:t xml:space="preserve">Write the handoff to course 1.5: the repository keeps the protected copy and stays out of the analysis flow, which takes its working copy from the collector over F10; a day's events reach the repository in the next morning's archive, which is where an end-to-end trace finds them; the repository's events — 1001 and 1101 findings, refused access, and retention deletions — are ready to become alerts; and course 1.12 sets up the backup of the archive and its catalog, which the audit custodian carries to the backup cabinet.</w:t>
       </w:r>
     </w:p>
     <w:p>
@@ -5998,7 +5998,7 @@
           <w:sz w:val="20"/>
           <w:szCs w:val="20"/>
         </w:rPr>
-        <w:t xml:space="preserve">The delete failed and appears as event 4656 on SBD-AUDIT01 and in ForwardedEvents on the collector, the tampered copy fails verification while the record passes, SBD-AUDIT01 has its first baseline, and the handoff names what course 1.12 inherits.</w:t>
+        <w:t xml:space="preserve">The delete failed and appears as event 4656 on SBD-AUDIT01 and in ForwardedEvents on the collector, the tampered copy fails verification while the record passes, SBD-AUDIT01 has its first baseline, and the handoff names what course 1.5 inherits.</w:t>
       </w:r>
     </w:p>
     <w:p>
@@ -6030,7 +6030,7 @@
           <w:sz w:val="21"/>
           <w:szCs w:val="21"/>
         </w:rPr>
-        <w:t xml:space="preserve">Evidence to keep: Keep the refused delete with both events, the tamper test's hash comparison, the scan set with hashes, and the handoff note to course 1.12.</w:t>
+        <w:t xml:space="preserve">Evidence to keep: Keep the refused delete with both events, the tamper test's hash comparison, the scan set with hashes, and the handoff note to course 1.5.</w:t>
       </w:r>
     </w:p>
     <w:tbl>
@@ -6577,7 +6577,7 @@
           <w:sz w:val="20"/>
           <w:szCs w:val="20"/>
         </w:rPr>
-        <w:t xml:space="preserve">An administrator's delete was refused and recorded on two systems.  A tampered copy failed verification; the record still passes.  SBD-AUDIT01 is baselined, and course 1.12 inherits a protected record.</w:t>
+        <w:t xml:space="preserve">An administrator's delete was refused and recorded on two systems.  A tampered copy failed verification; the record still passes.  SBD-AUDIT01 is baselined, and course 1.5 inherits a protected record.</w:t>
       </w:r>
     </w:p>
     <w:p>
@@ -6683,7 +6683,7 @@
           <w:sz w:val="16"/>
           <w:szCs w:val="16"/>
         </w:rPr>
-        <w:t xml:space="preserve">COURSE 1.11 / CLOSE OUT</w:t>
+        <w:t xml:space="preserve">COURSE 1.4 / CLOSE OUT</w:t>
       </w:r>
     </w:p>
     <w:p>
@@ -7384,7 +7384,7 @@
           <w:sz w:val="21"/>
           <w:szCs w:val="21"/>
         </w:rPr>
-        <w:t xml:space="preserve">That completes course 1.11. Course 1.12 builds analysis in SBD-SPLUNK01 on a working copy from the collector and turns the repository's findings into alerts.</w:t>
+        <w:t xml:space="preserve">That completes course 1.4. Course 1.5 builds analysis in SBD-SPLUNK01 on a working copy from the collector and turns the repository's findings into alerts.</w:t>
       </w:r>
     </w:p>
     <w:p>
@@ -7482,7 +7482,7 @@
         <w:sz w:val="15"/>
         <w:szCs w:val="15"/>
       </w:rPr>
-      <w:t xml:space="preserve">© 2026 Secure By Design Team LLC.   Course 1.11 · Materials edition 1.0     </w:t>
+      <w:t xml:space="preserve">© 2026 Secure By Design Team LLC.   Course 1.4 · Materials edition 1.0     </w:t>
     </w:r>
     <w:r>
       <w:rPr>

</xml_diff>

<commit_message>
Later courses name the part of course 1.1 they build on
compose-identity-foundation.py turned every reference to the former courses 1.1–1.8 into "course 1.1",
so some sentences named it two or three times. scripts/refine-identity-foundation-refs.py rewrites them from
the original text: the first reference names the course and its part ("course 1.1, part 7"), later ones
only the part ("part 6's root certificate"). No sentence in courses 1.2–1.12 now names course 1.1 twice.
Workbooks resynced; page counts checked.
</commit_message>
<xml_diff>
--- a/public/training/audit-repository/SecureByDesign-audit-repository-Workbook.docx
+++ b/public/training/audit-repository/SecureByDesign-audit-repository-Workbook.docx
@@ -503,7 +503,7 @@
           <w:sz w:val="21"/>
           <w:szCs w:val="21"/>
         </w:rPr>
-        <w:t xml:space="preserve">Have course 1.1's administration seats in place — the audit custodian's separate accounts in SBD Audit Custodians work from SBD-ADMIN-SRV01 (rule A04), and directory changes are Tier 0 work from AdminJumpBox01 — plus the Tier 1 SCC copy course 1.1 installed on SBD-ADMIN-SRV01, at course 1.1's tool and benchmark versions, for the first baseline.</w:t>
+        <w:t xml:space="preserve">Have course 1.1's administration seats in place — the audit custodian's separate accounts in SBD Audit Custodians work from SBD-ADMIN-SRV01 (rule A04), and directory changes are Tier 0 work from AdminJumpBox01 — plus the Tier 1 SCC copy part 8 installed on SBD-ADMIN-SRV01, at part 4's tool and benchmark versions, for the first baseline.</w:t>
       </w:r>
     </w:p>
     <w:p>
@@ -1070,7 +1070,7 @@
           <w:sz w:val="21"/>
           <w:szCs w:val="21"/>
         </w:rPr>
-        <w:t xml:space="preserve">Name every other identity and its one job: SBD-Catalog$ hashes arrivals, SBD-Retention$ is the only account the design lets delete, SBD Auditors read the record in remote sessions from SBD-ADMIN-SRV01, and SBD Audit Custodians (course 1.1) — the custodian's separate admin accounts — run the server but can't delete records either. In a Tier 0 session from AdminJumpBox01, create SBD Auditors under the Groups OU, add it to SBD-ADMIN-SRV01's seat GPO beside SBD Tier 1 Admins and SBD Audit Custodians (Allow log on locally, a change to course 1.1's STIG value that its exception record notes), and run Get-KdsRootKey on SBD-DC01. If it returns nothing, create the forest's one KDS root key with Add-KdsRootKey -EffectiveImmediately now: domain controllers wait up to ten hours before gMSAs can be created and used, so lesson 2 creates the accounts.</w:t>
+        <w:t xml:space="preserve">Name every other identity and its one job: SBD-Catalog$ hashes arrivals, SBD-Retention$ is the only account the design lets delete, SBD Auditors read the record in remote sessions from SBD-ADMIN-SRV01, and SBD Audit Custodians (course 1.1, part 8) — the custodian's separate admin accounts — run the server but can't delete records either. In a Tier 0 session from AdminJumpBox01, create SBD Auditors under the Groups OU, add it to SBD-ADMIN-SRV01's seat GPO beside SBD Tier 1 Admins and SBD Audit Custodians (Allow log on locally, a change to part 8's STIG value that its exception record notes), and run Get-KdsRootKey on SBD-DC01. If it returns nothing, create the forest's one KDS root key with Add-KdsRootKey -EffectiveImmediately now: domain controllers wait up to ten hours before gMSAs can be created and used, so lesson 2 creates the accounts.</w:t>
       </w:r>
     </w:p>
     <w:p>
@@ -1089,7 +1089,7 @@
           <w:sz w:val="21"/>
           <w:szCs w:val="21"/>
         </w:rPr>
-        <w:t xml:space="preserve">Build SBD-AUDIT01 (10.0.50.40, VLAN 50) as Windows Server with its data volume, DNS on both domain controllers, and time from the domain hierarchy (course 1.1): hypervisor time synchronization off, and w32tm /query /source naming a domain controller. Join it into a new Audit Servers OU (OU=Audit Servers,OU=SBD,DC=sbd,DC=test, created from AdminJumpBox01 with deletion protection) that already carries course 1.1's member-server STIG GPOs and course 1.1's two deny GPOs (the tier logon GPO and the network-logon deny GPO, never its Servers administrators GPO), so nothing granted to ordinary server administrators through the Servers OU reaches it. By GPO on that OU, make SBD Audit Custodians the local Administrators in place of Domain Admins, as the STIG's member-server rule requires, put SBD Auditors in Remote Management Users, and scope Remote Desktop and Windows Remote Management to SBD-ADMIN-SRV01 (10.0.60.20). Its Windows updates come through SBD-WSUS01 once course 1.7 builds it, in a group of their own: downloaded only, and installed when the custodian starts them, never by ordinary Tier 1 operators.</w:t>
+        <w:t xml:space="preserve">Build SBD-AUDIT01 (10.0.50.40, VLAN 50) as Windows Server with its data volume, DNS on both domain controllers, and time from the domain hierarchy (course 1.1, part 3): hypervisor time synchronization off, and w32tm /query /source naming a domain controller. Join it into a new Audit Servers OU (OU=Audit Servers,OU=SBD,DC=sbd,DC=test, created from AdminJumpBox01 with deletion protection) that already carries part 5's member-server STIG GPOs and part 8's two deny GPOs (the tier logon GPO and the network-logon deny GPO, never its Servers administrators GPO), so nothing granted to ordinary server administrators through the Servers OU reaches it. By GPO on that OU, make SBD Audit Custodians the local Administrators in place of Domain Admins, as the STIG's member-server rule requires, put SBD Auditors in Remote Management Users, and scope Remote Desktop and Windows Remote Management to SBD-ADMIN-SRV01 (10.0.60.20). Its Windows updates come through SBD-WSUS01 once course 1.7 builds it, in a group of their own: downloaded only, and installed when the custodian starts them, never by ordinary Tier 1 operators.</w:t>
       </w:r>
     </w:p>
     <w:p>
@@ -5707,7 +5707,7 @@
           <w:sz w:val="21"/>
           <w:szCs w:val="21"/>
         </w:rPr>
-        <w:t xml:space="preserve">Take SBD-AUDIT01's first SCAP baseline with the course 1.1 SCC and benchmark versions, run locally in the custodian's session: this server refuses SMB from VLAN 60, so a remote scan can't reach it, and the installer arrives from SBD-ADMIN-SRV01's course 1.1 copy over PowerShell remoting (Copy-Item -ToSession) with its course 1.1 hash checked. Store the results under C:\Evidence\audit-repository with hashes, and classify open items as course 1.1 taught — fix by GPO, deviation candidate, or POA&amp;M candidate — noting this course's documented additions: batch-logon rights and object-access auditing.</w:t>
+        <w:t xml:space="preserve">Take SBD-AUDIT01's first SCAP baseline with the course 1.1 SCC and benchmark versions, run locally in the custodian's session: this server refuses SMB from VLAN 60, so a remote scan can't reach it, and the installer arrives from SBD-ADMIN-SRV01's part 8 copy over PowerShell remoting (Copy-Item -ToSession) with its part 4 hash checked. Store the results under C:\Evidence\audit-repository with hashes, and classify open items as part 4 taught — fix by GPO, deviation candidate, or POA&amp;M candidate — noting this course's documented additions: batch-logon rights and object-access auditing.</w:t>
       </w:r>
     </w:p>
     <w:p>

</xml_diff>

<commit_message>
Console checks lead; the command stays as an optional route
Owner direction, 22 October 2026. 76 lessons now check in the console (Server Manager, ADUC, Sites and
Services, DNS Manager, GPMC, Certification Authority, Enterprise PKI, DHCP, Event Viewer, WSUS, Windows
Server Backup, SCC, STIG Viewer and others), with the PowerShell kept below as the optional route; 13
lessons name why they stay a command. The Splunk course is unchanged for now, and the time service is read
with w32tm (Microsoft's supported tool), not the registry. Guides, workbooks (page counts rechecked) and
the app content follow.
</commit_message>
<xml_diff>
--- a/public/training/audit-repository/SecureByDesign-audit-repository-Workbook.docx
+++ b/public/training/audit-repository/SecureByDesign-audit-repository-Workbook.docx
@@ -1288,6 +1288,36 @@
           <w:sz w:val="17"/>
           <w:szCs w:val="17"/>
         </w:rPr>
+        <w:t xml:space="preserve">WHY THIS STAYS A COMMAND  </w:t>
+      </w:r>
+      <w:r>
+        <w:rPr>
+          <w:rFonts w:ascii="Arial" w:cs="Arial" w:eastAsia="Arial" w:hAnsi="Arial"/>
+          <w:color w:val="193448"/>
+          <w:sz w:val="20"/>
+          <w:szCs w:val="20"/>
+        </w:rPr>
+        <w:t xml:space="preserve">Measuring a day of events (wevtutil epl and file sizes) is arithmetic over exported files; no console does it.</w:t>
+      </w:r>
+    </w:p>
+    <w:p>
+      <w:pPr>
+        <w:pBdr>
+          <w:left w:val="single" w:color="20647C" w:sz="18" w:space="8"/>
+        </w:pBdr>
+        <w:shd w:fill="F1F7FA" w:color="auto" w:val="clear"/>
+        <w:spacing w:after="160" w:before="120" w:line="288" w:lineRule="auto"/>
+        <w:ind w:left="160" w:right="160"/>
+      </w:pPr>
+      <w:r>
+        <w:rPr>
+          <w:rFonts w:ascii="Arial" w:cs="Arial" w:eastAsia="Arial" w:hAnsi="Arial"/>
+          <w:b/>
+          <w:bCs/>
+          <w:color w:val="20647C"/>
+          <w:sz w:val="17"/>
+          <w:szCs w:val="17"/>
+        </w:rPr>
         <w:t xml:space="preserve">WHAT SUCCESS LOOKS LIKE  </w:t>
       </w:r>
       <w:r>
@@ -2244,6 +2274,182 @@
     </w:p>
     <w:p>
       <w:pPr>
+        <w:pBdr>
+          <w:left w:val="single" w:color="20647C" w:sz="18" w:space="8"/>
+        </w:pBdr>
+        <w:shd w:fill="F1F7FA" w:color="auto" w:val="clear"/>
+        <w:spacing w:after="160" w:before="120" w:line="288" w:lineRule="auto"/>
+        <w:ind w:left="160" w:right="160"/>
+      </w:pPr>
+      <w:r>
+        <w:rPr>
+          <w:rFonts w:ascii="Arial" w:cs="Arial" w:eastAsia="Arial" w:hAnsi="Arial"/>
+          <w:b/>
+          <w:bCs/>
+          <w:color w:val="20647C"/>
+          <w:sz w:val="17"/>
+          <w:szCs w:val="17"/>
+        </w:rPr>
+        <w:t xml:space="preserve">CHECK IT IN THE CONSOLE  </w:t>
+      </w:r>
+      <w:r>
+        <w:rPr>
+          <w:rFonts w:ascii="Arial" w:cs="Arial" w:eastAsia="Arial" w:hAnsi="Arial"/>
+          <w:color w:val="193448"/>
+          <w:sz w:val="20"/>
+          <w:szCs w:val="20"/>
+        </w:rPr>
+        <w:t xml:space="preserve">Server Manager</w:t>
+      </w:r>
+    </w:p>
+    <w:p>
+      <w:pPr>
+        <w:spacing w:after="160" w:before="0" w:line="288" w:lineRule="auto"/>
+      </w:pPr>
+      <w:r>
+        <w:rPr>
+          <w:rFonts w:ascii="Arial" w:cs="Arial" w:eastAsia="Arial" w:hAnsi="Arial"/>
+          <w:color w:val="526B7E"/>
+          <w:sz w:val="21"/>
+          <w:szCs w:val="21"/>
+        </w:rPr>
+        <w:t xml:space="preserve">1. File and Storage Services &gt; Shares &gt; LogArchive &gt; Properties &gt; Settings: Encrypt data access is checked; Permissions: the planned groups.</w:t>
+      </w:r>
+    </w:p>
+    <w:p>
+      <w:pPr>
+        <w:pBdr>
+          <w:left w:val="single" w:color="20647C" w:sz="18" w:space="8"/>
+        </w:pBdr>
+        <w:shd w:fill="F1F7FA" w:color="auto" w:val="clear"/>
+        <w:spacing w:after="160" w:before="120" w:line="288" w:lineRule="auto"/>
+        <w:ind w:left="160" w:right="160"/>
+      </w:pPr>
+      <w:r>
+        <w:rPr>
+          <w:rFonts w:ascii="Arial" w:cs="Arial" w:eastAsia="Arial" w:hAnsi="Arial"/>
+          <w:b/>
+          <w:bCs/>
+          <w:color w:val="20647C"/>
+          <w:sz w:val="17"/>
+          <w:szCs w:val="17"/>
+        </w:rPr>
+        <w:t xml:space="preserve">THEN, IN  </w:t>
+      </w:r>
+      <w:r>
+        <w:rPr>
+          <w:rFonts w:ascii="Arial" w:cs="Arial" w:eastAsia="Arial" w:hAnsi="Arial"/>
+          <w:color w:val="193448"/>
+          <w:sz w:val="20"/>
+          <w:szCs w:val="20"/>
+        </w:rPr>
+        <w:t xml:space="preserve">File Explorer</w:t>
+      </w:r>
+    </w:p>
+    <w:p>
+      <w:pPr>
+        <w:spacing w:after="160" w:before="0" w:line="288" w:lineRule="auto"/>
+      </w:pPr>
+      <w:r>
+        <w:rPr>
+          <w:rFonts w:ascii="Arial" w:cs="Arial" w:eastAsia="Arial" w:hAnsi="Arial"/>
+          <w:color w:val="526B7E"/>
+          <w:sz w:val="21"/>
+          <w:szCs w:val="21"/>
+        </w:rPr>
+        <w:t xml:space="preserve">1. D:\LogArchive &gt; Properties &gt; Security &gt; Advanced: the owner and permissions match the design.</w:t>
+      </w:r>
+    </w:p>
+    <w:p>
+      <w:pPr>
+        <w:pBdr>
+          <w:left w:val="single" w:color="20647C" w:sz="18" w:space="8"/>
+        </w:pBdr>
+        <w:shd w:fill="F1F7FA" w:color="auto" w:val="clear"/>
+        <w:spacing w:after="160" w:before="120" w:line="288" w:lineRule="auto"/>
+        <w:ind w:left="160" w:right="160"/>
+      </w:pPr>
+      <w:r>
+        <w:rPr>
+          <w:rFonts w:ascii="Arial" w:cs="Arial" w:eastAsia="Arial" w:hAnsi="Arial"/>
+          <w:b/>
+          <w:bCs/>
+          <w:color w:val="20647C"/>
+          <w:sz w:val="17"/>
+          <w:szCs w:val="17"/>
+        </w:rPr>
+        <w:t xml:space="preserve">THEN, IN  </w:t>
+      </w:r>
+      <w:r>
+        <w:rPr>
+          <w:rFonts w:ascii="Arial" w:cs="Arial" w:eastAsia="Arial" w:hAnsi="Arial"/>
+          <w:color w:val="193448"/>
+          <w:sz w:val="20"/>
+          <w:szCs w:val="20"/>
+        </w:rPr>
+        <w:t xml:space="preserve">Server Manager</w:t>
+      </w:r>
+    </w:p>
+    <w:p>
+      <w:pPr>
+        <w:spacing w:after="160" w:before="0" w:line="288" w:lineRule="auto"/>
+      </w:pPr>
+      <w:r>
+        <w:rPr>
+          <w:rFonts w:ascii="Arial" w:cs="Arial" w:eastAsia="Arial" w:hAnsi="Arial"/>
+          <w:color w:val="526B7E"/>
+          <w:sz w:val="21"/>
+          <w:szCs w:val="21"/>
+        </w:rPr>
+        <w:t xml:space="preserve">1. Manage &gt; Remove Roles and Features: SMB 1.0/CIFS File Sharing Support is not installed.</w:t>
+      </w:r>
+    </w:p>
+    <w:p>
+      <w:pPr>
+        <w:pBdr>
+          <w:left w:val="single" w:color="20647C" w:sz="18" w:space="8"/>
+        </w:pBdr>
+        <w:shd w:fill="F1F7FA" w:color="auto" w:val="clear"/>
+        <w:spacing w:after="160" w:before="120" w:line="288" w:lineRule="auto"/>
+        <w:ind w:left="160" w:right="160"/>
+      </w:pPr>
+      <w:r>
+        <w:rPr>
+          <w:rFonts w:ascii="Arial" w:cs="Arial" w:eastAsia="Arial" w:hAnsi="Arial"/>
+          <w:b/>
+          <w:bCs/>
+          <w:color w:val="20647C"/>
+          <w:sz w:val="17"/>
+          <w:szCs w:val="17"/>
+        </w:rPr>
+        <w:t xml:space="preserve">STAYS A COMMAND  </w:t>
+      </w:r>
+      <w:r>
+        <w:rPr>
+          <w:rFonts w:ascii="Arial" w:cs="Arial" w:eastAsia="Arial" w:hAnsi="Arial"/>
+          <w:color w:val="193448"/>
+          <w:sz w:val="20"/>
+          <w:szCs w:val="20"/>
+        </w:rPr>
+        <w:t xml:space="preserve">Get-SmbServerConfiguration for RejectUnencryptedAccess: no console shows the server-wide setting.</w:t>
+      </w:r>
+    </w:p>
+    <w:p>
+      <w:pPr>
+        <w:spacing w:after="160" w:before="0" w:line="288" w:lineRule="auto"/>
+      </w:pPr>
+      <w:r>
+        <w:rPr>
+          <w:rFonts w:ascii="Arial" w:cs="Arial" w:eastAsia="Arial" w:hAnsi="Arial"/>
+          <w:color w:val="526B7E"/>
+          <w:sz w:val="21"/>
+          <w:szCs w:val="21"/>
+        </w:rPr>
+        <w:t xml:space="preserve">Command-line route (optional):</w:t>
+      </w:r>
+    </w:p>
+    <w:p>
+      <w:pPr>
         <w:shd w:fill="F1F7FA" w:color="auto" w:val="clear"/>
         <w:spacing w:after="0" w:before="0" w:line="252" w:lineRule="auto"/>
         <w:ind w:left="160" w:right="160"/>
@@ -3458,6 +3664,108 @@
     </w:p>
     <w:p>
       <w:pPr>
+        <w:pBdr>
+          <w:left w:val="single" w:color="20647C" w:sz="18" w:space="8"/>
+        </w:pBdr>
+        <w:shd w:fill="F1F7FA" w:color="auto" w:val="clear"/>
+        <w:spacing w:after="160" w:before="120" w:line="288" w:lineRule="auto"/>
+        <w:ind w:left="160" w:right="160"/>
+      </w:pPr>
+      <w:r>
+        <w:rPr>
+          <w:rFonts w:ascii="Arial" w:cs="Arial" w:eastAsia="Arial" w:hAnsi="Arial"/>
+          <w:b/>
+          <w:bCs/>
+          <w:color w:val="20647C"/>
+          <w:sz w:val="17"/>
+          <w:szCs w:val="17"/>
+        </w:rPr>
+        <w:t xml:space="preserve">CHECK IT IN THE CONSOLE  </w:t>
+      </w:r>
+      <w:r>
+        <w:rPr>
+          <w:rFonts w:ascii="Arial" w:cs="Arial" w:eastAsia="Arial" w:hAnsi="Arial"/>
+          <w:color w:val="193448"/>
+          <w:sz w:val="20"/>
+          <w:szCs w:val="20"/>
+        </w:rPr>
+        <w:t xml:space="preserve">Event Viewer (eventvwr.msc)</w:t>
+      </w:r>
+    </w:p>
+    <w:p>
+      <w:pPr>
+        <w:spacing w:after="160" w:before="0" w:line="288" w:lineRule="auto"/>
+      </w:pPr>
+      <w:r>
+        <w:rPr>
+          <w:rFonts w:ascii="Arial" w:cs="Arial" w:eastAsia="Arial" w:hAnsi="Arial"/>
+          <w:color w:val="526B7E"/>
+          <w:sz w:val="21"/>
+          <w:szCs w:val="21"/>
+        </w:rPr>
+        <w:t xml:space="preserve">1. Windows Logs &gt; Application &gt; Filter: the verification source, Event IDs 1100 and 1101: today's result is 1100.</w:t>
+      </w:r>
+    </w:p>
+    <w:p>
+      <w:pPr>
+        <w:pBdr>
+          <w:left w:val="single" w:color="20647C" w:sz="18" w:space="8"/>
+        </w:pBdr>
+        <w:shd w:fill="F1F7FA" w:color="auto" w:val="clear"/>
+        <w:spacing w:after="160" w:before="120" w:line="288" w:lineRule="auto"/>
+        <w:ind w:left="160" w:right="160"/>
+      </w:pPr>
+      <w:r>
+        <w:rPr>
+          <w:rFonts w:ascii="Arial" w:cs="Arial" w:eastAsia="Arial" w:hAnsi="Arial"/>
+          <w:b/>
+          <w:bCs/>
+          <w:color w:val="20647C"/>
+          <w:sz w:val="17"/>
+          <w:szCs w:val="17"/>
+        </w:rPr>
+        <w:t xml:space="preserve">THEN, IN  </w:t>
+      </w:r>
+      <w:r>
+        <w:rPr>
+          <w:rFonts w:ascii="Arial" w:cs="Arial" w:eastAsia="Arial" w:hAnsi="Arial"/>
+          <w:color w:val="193448"/>
+          <w:sz w:val="20"/>
+          <w:szCs w:val="20"/>
+        </w:rPr>
+        <w:t xml:space="preserve">Notepad</w:t>
+      </w:r>
+    </w:p>
+    <w:p>
+      <w:pPr>
+        <w:spacing w:after="160" w:before="0" w:line="288" w:lineRule="auto"/>
+      </w:pPr>
+      <w:r>
+        <w:rPr>
+          <w:rFonts w:ascii="Arial" w:cs="Arial" w:eastAsia="Arial" w:hAnsi="Arial"/>
+          <w:color w:val="526B7E"/>
+          <w:sz w:val="21"/>
+          <w:szCs w:val="21"/>
+        </w:rPr>
+        <w:t xml:space="preserve">1. D:\LogArchive\Catalog: open today's verify report and confirm every line reads OK.</w:t>
+      </w:r>
+    </w:p>
+    <w:p>
+      <w:pPr>
+        <w:spacing w:after="160" w:before="0" w:line="288" w:lineRule="auto"/>
+      </w:pPr>
+      <w:r>
+        <w:rPr>
+          <w:rFonts w:ascii="Arial" w:cs="Arial" w:eastAsia="Arial" w:hAnsi="Arial"/>
+          <w:color w:val="526B7E"/>
+          <w:sz w:val="21"/>
+          <w:szCs w:val="21"/>
+        </w:rPr>
+        <w:t xml:space="preserve">Command-line route (optional):</w:t>
+      </w:r>
+    </w:p>
+    <w:p>
+      <w:pPr>
         <w:shd w:fill="F1F7FA" w:color="auto" w:val="clear"/>
         <w:spacing w:after="0" w:before="0" w:line="252" w:lineRule="auto"/>
         <w:ind w:left="160" w:right="160"/>
@@ -4636,6 +4944,92 @@
     </w:p>
     <w:p>
       <w:pPr>
+        <w:pBdr>
+          <w:left w:val="single" w:color="20647C" w:sz="18" w:space="8"/>
+        </w:pBdr>
+        <w:shd w:fill="F1F7FA" w:color="auto" w:val="clear"/>
+        <w:spacing w:after="160" w:before="120" w:line="288" w:lineRule="auto"/>
+        <w:ind w:left="160" w:right="160"/>
+      </w:pPr>
+      <w:r>
+        <w:rPr>
+          <w:rFonts w:ascii="Arial" w:cs="Arial" w:eastAsia="Arial" w:hAnsi="Arial"/>
+          <w:b/>
+          <w:bCs/>
+          <w:color w:val="20647C"/>
+          <w:sz w:val="17"/>
+          <w:szCs w:val="17"/>
+        </w:rPr>
+        <w:t xml:space="preserve">CHECK IT IN THE CONSOLE  </w:t>
+      </w:r>
+      <w:r>
+        <w:rPr>
+          <w:rFonts w:ascii="Arial" w:cs="Arial" w:eastAsia="Arial" w:hAnsi="Arial"/>
+          <w:color w:val="193448"/>
+          <w:sz w:val="20"/>
+          <w:szCs w:val="20"/>
+        </w:rPr>
+        <w:t xml:space="preserve">Task Scheduler (taskschd.msc)</w:t>
+      </w:r>
+    </w:p>
+    <w:p>
+      <w:pPr>
+        <w:spacing w:after="160" w:before="0" w:line="288" w:lineRule="auto"/>
+      </w:pPr>
+      <w:r>
+        <w:rPr>
+          <w:rFonts w:ascii="Arial" w:cs="Arial" w:eastAsia="Arial" w:hAnsi="Arial"/>
+          <w:color w:val="526B7E"/>
+          <w:sz w:val="21"/>
+          <w:szCs w:val="21"/>
+        </w:rPr>
+        <w:t xml:space="preserve">1. SBD Repository Retention &gt; Triggers: none.</w:t>
+      </w:r>
+    </w:p>
+    <w:p>
+      <w:pPr>
+        <w:spacing w:after="160" w:before="0" w:line="288" w:lineRule="auto"/>
+      </w:pPr>
+      <w:r>
+        <w:rPr>
+          <w:rFonts w:ascii="Arial" w:cs="Arial" w:eastAsia="Arial" w:hAnsi="Arial"/>
+          <w:color w:val="526B7E"/>
+          <w:sz w:val="21"/>
+          <w:szCs w:val="21"/>
+        </w:rPr>
+        <w:t xml:space="preserve">2. General: runs as SBD-Retention$.</w:t>
+      </w:r>
+    </w:p>
+    <w:p>
+      <w:pPr>
+        <w:spacing w:after="160" w:before="0" w:line="288" w:lineRule="auto"/>
+      </w:pPr>
+      <w:r>
+        <w:rPr>
+          <w:rFonts w:ascii="Arial" w:cs="Arial" w:eastAsia="Arial" w:hAnsi="Arial"/>
+          <w:color w:val="526B7E"/>
+          <w:sz w:val="21"/>
+          <w:szCs w:val="21"/>
+        </w:rPr>
+        <w:t xml:space="preserve">3. History: the approved test run, which refused the young archive.</w:t>
+      </w:r>
+    </w:p>
+    <w:p>
+      <w:pPr>
+        <w:spacing w:after="160" w:before="0" w:line="288" w:lineRule="auto"/>
+      </w:pPr>
+      <w:r>
+        <w:rPr>
+          <w:rFonts w:ascii="Arial" w:cs="Arial" w:eastAsia="Arial" w:hAnsi="Arial"/>
+          <w:color w:val="526B7E"/>
+          <w:sz w:val="21"/>
+          <w:szCs w:val="21"/>
+        </w:rPr>
+        <w:t xml:space="preserve">Command-line route (optional):</w:t>
+      </w:r>
+    </w:p>
+    <w:p>
+      <w:pPr>
         <w:shd w:fill="F1F7FA" w:color="auto" w:val="clear"/>
         <w:spacing w:after="0" w:before="0" w:line="252" w:lineRule="auto"/>
         <w:ind w:left="160" w:right="160"/>
@@ -5745,6 +6139,122 @@
           <w:szCs w:val="26"/>
         </w:rPr>
         <w:t xml:space="preserve">Check your result</w:t>
+      </w:r>
+    </w:p>
+    <w:p>
+      <w:pPr>
+        <w:pBdr>
+          <w:left w:val="single" w:color="20647C" w:sz="18" w:space="8"/>
+        </w:pBdr>
+        <w:shd w:fill="F1F7FA" w:color="auto" w:val="clear"/>
+        <w:spacing w:after="160" w:before="120" w:line="288" w:lineRule="auto"/>
+        <w:ind w:left="160" w:right="160"/>
+      </w:pPr>
+      <w:r>
+        <w:rPr>
+          <w:rFonts w:ascii="Arial" w:cs="Arial" w:eastAsia="Arial" w:hAnsi="Arial"/>
+          <w:b/>
+          <w:bCs/>
+          <w:color w:val="20647C"/>
+          <w:sz w:val="17"/>
+          <w:szCs w:val="17"/>
+        </w:rPr>
+        <w:t xml:space="preserve">CHECK IT IN THE CONSOLE  </w:t>
+      </w:r>
+      <w:r>
+        <w:rPr>
+          <w:rFonts w:ascii="Arial" w:cs="Arial" w:eastAsia="Arial" w:hAnsi="Arial"/>
+          <w:color w:val="193448"/>
+          <w:sz w:val="20"/>
+          <w:szCs w:val="20"/>
+        </w:rPr>
+        <w:t xml:space="preserve">File Explorer</w:t>
+      </w:r>
+    </w:p>
+    <w:p>
+      <w:pPr>
+        <w:spacing w:after="160" w:before="0" w:line="288" w:lineRule="auto"/>
+      </w:pPr>
+      <w:r>
+        <w:rPr>
+          <w:rFonts w:ascii="Arial" w:cs="Arial" w:eastAsia="Arial" w:hAnsi="Arial"/>
+          <w:color w:val="526B7E"/>
+          <w:sz w:val="21"/>
+          <w:szCs w:val="21"/>
+        </w:rPr>
+        <w:t xml:space="preserve">1. Try to delete the newest ForwardedEvents archive: access is denied.</w:t>
+      </w:r>
+    </w:p>
+    <w:p>
+      <w:pPr>
+        <w:pBdr>
+          <w:left w:val="single" w:color="20647C" w:sz="18" w:space="8"/>
+        </w:pBdr>
+        <w:shd w:fill="F1F7FA" w:color="auto" w:val="clear"/>
+        <w:spacing w:after="160" w:before="120" w:line="288" w:lineRule="auto"/>
+        <w:ind w:left="160" w:right="160"/>
+      </w:pPr>
+      <w:r>
+        <w:rPr>
+          <w:rFonts w:ascii="Arial" w:cs="Arial" w:eastAsia="Arial" w:hAnsi="Arial"/>
+          <w:b/>
+          <w:bCs/>
+          <w:color w:val="20647C"/>
+          <w:sz w:val="17"/>
+          <w:szCs w:val="17"/>
+        </w:rPr>
+        <w:t xml:space="preserve">THEN, IN  </w:t>
+      </w:r>
+      <w:r>
+        <w:rPr>
+          <w:rFonts w:ascii="Arial" w:cs="Arial" w:eastAsia="Arial" w:hAnsi="Arial"/>
+          <w:color w:val="193448"/>
+          <w:sz w:val="20"/>
+          <w:szCs w:val="20"/>
+        </w:rPr>
+        <w:t xml:space="preserve">Event Viewer (eventvwr.msc)</w:t>
+      </w:r>
+    </w:p>
+    <w:p>
+      <w:pPr>
+        <w:spacing w:after="160" w:before="0" w:line="288" w:lineRule="auto"/>
+      </w:pPr>
+      <w:r>
+        <w:rPr>
+          <w:rFonts w:ascii="Arial" w:cs="Arial" w:eastAsia="Arial" w:hAnsi="Arial"/>
+          <w:color w:val="526B7E"/>
+          <w:sz w:val="21"/>
+          <w:szCs w:val="21"/>
+        </w:rPr>
+        <w:t xml:space="preserve">1. On SBD-AUDIT01, Windows Logs &gt; Security &gt; Filter: Event ID 4656 in the last hour.</w:t>
+      </w:r>
+    </w:p>
+    <w:p>
+      <w:pPr>
+        <w:spacing w:after="160" w:before="0" w:line="288" w:lineRule="auto"/>
+      </w:pPr>
+      <w:r>
+        <w:rPr>
+          <w:rFonts w:ascii="Arial" w:cs="Arial" w:eastAsia="Arial" w:hAnsi="Arial"/>
+          <w:color w:val="526B7E"/>
+          <w:sz w:val="21"/>
+          <w:szCs w:val="21"/>
+        </w:rPr>
+        <w:t xml:space="preserve">2. On SBD-SYSLOG01, Forwarded Events: the same event from SBD-AUDIT01.</w:t>
+      </w:r>
+    </w:p>
+    <w:p>
+      <w:pPr>
+        <w:spacing w:after="160" w:before="0" w:line="288" w:lineRule="auto"/>
+      </w:pPr>
+      <w:r>
+        <w:rPr>
+          <w:rFonts w:ascii="Arial" w:cs="Arial" w:eastAsia="Arial" w:hAnsi="Arial"/>
+          <w:color w:val="526B7E"/>
+          <w:sz w:val="21"/>
+          <w:szCs w:val="21"/>
+        </w:rPr>
+        <w:t xml:space="preserve">Command-line route (optional):</w:t>
       </w:r>
     </w:p>
     <w:p>

</xml_diff>